<commit_message>
aby (members + declaration + ToDo)
</commit_message>
<xml_diff>
--- a/documentation/[REVISED ON CONSULTATION] - MIS-of-Fund-Generations-MAAB-Membership-of-the-Philippine-Red-Cross-Cavite-Chapter.docx
+++ b/documentation/[REVISED ON CONSULTATION] - MIS-of-Fund-Generations-MAAB-Membership-of-the-Philippine-Red-Cross-Cavite-Chapter.docx
@@ -1,6 +1,6 @@
 
 <file path=word/document.xml><?xml version="1.0" encoding="utf-8"?>
-<w:document xmlns:wpc="http://schemas.microsoft.com/office/word/2010/wordprocessingCanvas" xmlns:cx="http://schemas.microsoft.com/office/drawing/2014/chartex" xmlns:cx1="http://schemas.microsoft.com/office/drawing/2015/9/8/chartex" xmlns:cx2="http://schemas.microsoft.com/office/drawing/2015/10/21/chartex" xmlns:cx3="http://schemas.microsoft.com/office/drawing/2016/5/9/chartex" xmlns:cx4="http://schemas.microsoft.com/office/drawing/2016/5/10/chartex" xmlns:cx5="http://schemas.microsoft.com/office/drawing/2016/5/11/chartex" xmlns:cx6="http://schemas.microsoft.com/office/drawing/2016/5/12/chartex" xmlns:cx7="http://schemas.microsoft.com/office/drawing/2016/5/13/chartex" xmlns:cx8="http://schemas.microsoft.com/office/drawing/2016/5/14/chartex" xmlns:mc="http://schemas.openxmlformats.org/markup-compatibility/2006" xmlns:aink="http://schemas.microsoft.com/office/drawing/2016/ink" xmlns:am3d="http://schemas.microsoft.com/office/drawing/2017/model3d" xmlns:o="urn:schemas-microsoft-com:office:office" xmlns:oel="http://schemas.microsoft.com/office/2019/extlst" xmlns:r="http://schemas.openxmlformats.org/officeDocument/2006/relationships" xmlns:m="http://schemas.openxmlformats.org/officeDocument/2006/math" xmlns:v="urn:schemas-microsoft-com:vml" xmlns:wp14="http://schemas.microsoft.com/office/word/2010/wordprocessingDrawing" xmlns:wp="http://schemas.openxmlformats.org/drawingml/2006/wordprocessingDrawing" xmlns:w10="urn:schemas-microsoft-com:office:word" xmlns:w="http://schemas.openxmlformats.org/wordprocessingml/2006/main" xmlns:w14="http://schemas.microsoft.com/office/word/2010/wordml" xmlns:w15="http://schemas.microsoft.com/office/word/2012/wordml" xmlns:w16cex="http://schemas.microsoft.com/office/word/2018/wordml/cex" xmlns:w16cid="http://schemas.microsoft.com/office/word/2016/wordml/cid" xmlns:w16="http://schemas.microsoft.com/office/word/2018/wordml" xmlns:w16sdtdh="http://schemas.microsoft.com/office/word/2020/wordml/sdtdatahash" xmlns:w16se="http://schemas.microsoft.com/office/word/2015/wordml/symex" xmlns:wpg="http://schemas.microsoft.com/office/word/2010/wordprocessingGroup" xmlns:wpi="http://schemas.microsoft.com/office/word/2010/wordprocessingInk" xmlns:wne="http://schemas.microsoft.com/office/word/2006/wordml" xmlns:wps="http://schemas.microsoft.com/office/word/2010/wordprocessingShape" mc:Ignorable="w14 w15 w16se w16cid w16 w16cex w16sdtdh wp14">
+<w:document xmlns:wpc="http://schemas.microsoft.com/office/word/2010/wordprocessingCanvas" xmlns:cx="http://schemas.microsoft.com/office/drawing/2014/chartex" xmlns:cx1="http://schemas.microsoft.com/office/drawing/2015/9/8/chartex" xmlns:cx2="http://schemas.microsoft.com/office/drawing/2015/10/21/chartex" xmlns:cx3="http://schemas.microsoft.com/office/drawing/2016/5/9/chartex" xmlns:cx4="http://schemas.microsoft.com/office/drawing/2016/5/10/chartex" xmlns:cx5="http://schemas.microsoft.com/office/drawing/2016/5/11/chartex" xmlns:cx6="http://schemas.microsoft.com/office/drawing/2016/5/12/chartex" xmlns:cx7="http://schemas.microsoft.com/office/drawing/2016/5/13/chartex" xmlns:cx8="http://schemas.microsoft.com/office/drawing/2016/5/14/chartex" xmlns:mc="http://schemas.openxmlformats.org/markup-compatibility/2006" xmlns:aink="http://schemas.microsoft.com/office/drawing/2016/ink" xmlns:am3d="http://schemas.microsoft.com/office/drawing/2017/model3d" xmlns:o="urn:schemas-microsoft-com:office:office" xmlns:oel="http://schemas.microsoft.com/office/2019/extlst" xmlns:r="http://schemas.openxmlformats.org/officeDocument/2006/relationships" xmlns:m="http://schemas.openxmlformats.org/officeDocument/2006/math" xmlns:v="urn:schemas-microsoft-com:vml" xmlns:wp14="http://schemas.microsoft.com/office/word/2010/wordprocessingDrawing" xmlns:wp="http://schemas.openxmlformats.org/drawingml/2006/wordprocessingDrawing" xmlns:w10="urn:schemas-microsoft-com:office:word" xmlns:w="http://schemas.openxmlformats.org/wordprocessingml/2006/main" xmlns:w14="http://schemas.microsoft.com/office/word/2010/wordml" xmlns:w15="http://schemas.microsoft.com/office/word/2012/wordml" xmlns:w16cex="http://schemas.microsoft.com/office/word/2018/wordml/cex" xmlns:w16cid="http://schemas.microsoft.com/office/word/2016/wordml/cid" xmlns:w16="http://schemas.microsoft.com/office/word/2018/wordml" xmlns:w16du="http://schemas.microsoft.com/office/word/2023/wordml/word16du" xmlns:w16sdtdh="http://schemas.microsoft.com/office/word/2020/wordml/sdtdatahash" xmlns:w16sdtfl="http://schemas.microsoft.com/office/word/2024/wordml/sdtformatlock" xmlns:w16se="http://schemas.microsoft.com/office/word/2015/wordml/symex" xmlns:wpg="http://schemas.microsoft.com/office/word/2010/wordprocessingGroup" xmlns:wpi="http://schemas.microsoft.com/office/word/2010/wordprocessingInk" xmlns:wne="http://schemas.microsoft.com/office/word/2006/wordml" xmlns:wps="http://schemas.microsoft.com/office/word/2010/wordprocessingShape" mc:Ignorable="w14 w15 w16se w16cid w16 w16cex w16sdtdh w16sdtfl w16du wp14">
   <w:body>
     <w:p>
       <w:pPr>
@@ -930,23 +930,7 @@
       <w:bookmarkStart w:id="1" w:name="Josh_Crisostomo_John_Benedict_Custodio_A"/>
       <w:bookmarkEnd w:id="1"/>
       <w:r>
-        <w:t xml:space="preserve">Josh Crisostomo John Benedict </w:t>
-      </w:r>
-      <w:proofErr w:type="spellStart"/>
-      <w:r>
-        <w:t>Custodio</w:t>
-      </w:r>
-      <w:proofErr w:type="spellEnd"/>
-      <w:r>
-        <w:t xml:space="preserve"> </w:t>
-      </w:r>
-      <w:proofErr w:type="spellStart"/>
-      <w:r>
-        <w:t>Abegail</w:t>
-      </w:r>
-      <w:proofErr w:type="spellEnd"/>
-      <w:r>
-        <w:t xml:space="preserve"> Jane S. Montejo </w:t>
+        <w:t xml:space="preserve">Josh Crisostomo John Benedict Custodio Abegail Jane S. Montejo </w:t>
       </w:r>
       <w:r>
         <w:rPr>
@@ -1018,7 +1002,6 @@
         </w:rPr>
         <w:t xml:space="preserve"> </w:t>
       </w:r>
-      <w:proofErr w:type="spellStart"/>
       <w:r>
         <w:rPr>
           <w:rFonts w:ascii="Arial"/>
@@ -1027,7 +1010,6 @@
         </w:rPr>
         <w:t>Sanorjo</w:t>
       </w:r>
-      <w:proofErr w:type="spellEnd"/>
     </w:p>
     <w:p>
       <w:pPr>
@@ -1130,7 +1112,7 @@
           </mc:Choice>
           <mc:Fallback>
             <w:pict>
-              <v:shape w14:anchorId="1A1BCB76" id="Graphic 2" o:spid="_x0000_s1026" style="position:absolute;margin-left:108.05pt;margin-top:20.8pt;width:414.95pt;height:2.25pt;z-index:-15728640;visibility:visible;mso-wrap-style:square;mso-wrap-distance-left:0;mso-wrap-distance-top:0;mso-wrap-distance-right:0;mso-wrap-distance-bottom:0;mso-position-horizontal:absolute;mso-position-horizontal-relative:page;mso-position-vertical:absolute;mso-position-vertical-relative:text;v-text-anchor:top" coordsize="5269865,28575" o:gfxdata="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" path="m5269611,l,,,28575r5269611,l5269611,xe" fillcolor="black" stroked="f">
+              <v:shape w14:anchorId="1C988E38" id="Graphic 2" o:spid="_x0000_s1026" style="position:absolute;margin-left:108.05pt;margin-top:20.8pt;width:414.95pt;height:2.25pt;z-index:-15728640;visibility:visible;mso-wrap-style:square;mso-wrap-distance-left:0;mso-wrap-distance-top:0;mso-wrap-distance-right:0;mso-wrap-distance-bottom:0;mso-position-horizontal:absolute;mso-position-horizontal-relative:page;mso-position-vertical:absolute;mso-position-vertical-relative:text;v-text-anchor:top" coordsize="5269865,28575" o:gfxdata="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" path="m5269611,l,,,28575r5269611,l5269611,xe" fillcolor="black" stroked="f">
                 <v:path arrowok="t"/>
                 <w10:wrap type="topAndBottom" anchorx="page"/>
               </v:shape>
@@ -1280,7 +1262,7 @@
           </mc:Choice>
           <mc:Fallback>
             <w:pict>
-              <v:shape w14:anchorId="352B3521" id="Graphic 3" o:spid="_x0000_s1026" style="position:absolute;margin-left:108pt;margin-top:-40.5pt;width:415.7pt;height:2.25pt;z-index:15729152;visibility:visible;mso-wrap-style:square;mso-wrap-distance-left:0;mso-wrap-distance-top:0;mso-wrap-distance-right:0;mso-wrap-distance-bottom:0;mso-position-horizontal:absolute;mso-position-horizontal-relative:page;mso-position-vertical:absolute;mso-position-vertical-relative:text;v-text-anchor:top" coordsize="5279390,28575" o:gfxdata="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" path="m5279136,l,,,28575r5279136,l5279136,xe" fillcolor="black" stroked="f">
+              <v:shape w14:anchorId="5F94C930" id="Graphic 3" o:spid="_x0000_s1026" style="position:absolute;margin-left:108pt;margin-top:-40.5pt;width:415.7pt;height:2.25pt;z-index:15729152;visibility:visible;mso-wrap-style:square;mso-wrap-distance-left:0;mso-wrap-distance-top:0;mso-wrap-distance-right:0;mso-wrap-distance-bottom:0;mso-position-horizontal:absolute;mso-position-horizontal-relative:page;mso-position-vertical:absolute;mso-position-vertical-relative:text;v-text-anchor:top" coordsize="5279390,28575" o:gfxdata="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" path="m5279136,l,,,28575r5279136,l5279136,xe" fillcolor="black" stroked="f">
                 <v:path arrowok="t"/>
                 <w10:wrap anchorx="page"/>
               </v:shape>
@@ -1454,15 +1436,7 @@
         <w:jc w:val="both"/>
       </w:pPr>
       <w:r>
-        <w:t xml:space="preserve">The Philippine Red Cross Cavite Chapter’s Fund Generations Department faces challenges in managing the Membership Accident Assistance Benefits (MAAB) Program, ID inventory, and receiving reports from Silang and </w:t>
-      </w:r>
-      <w:proofErr w:type="spellStart"/>
-      <w:r>
-        <w:t>Dasma</w:t>
-      </w:r>
-      <w:proofErr w:type="spellEnd"/>
-      <w:r>
-        <w:t xml:space="preserve"> Red Cross branches manually. With increasing member numbers and complexity, these processes have become difficult to track effectively.</w:t>
+        <w:t>The Philippine Red Cross Cavite Chapter’s Fund Generations Department faces challenges in managing the Membership Accident Assistance Benefits (MAAB) Program, ID inventory, and receiving reports from Silang and Dasma Red Cross branches manually. With increasing member numbers and complexity, these processes have become difficult to track effectively.</w:t>
       </w:r>
     </w:p>
     <w:p>
@@ -2493,13 +2467,8 @@
         <w:spacing w:before="247"/>
         <w:ind w:left="1496" w:hanging="174"/>
       </w:pPr>
-      <w:proofErr w:type="gramStart"/>
-      <w:r>
-        <w:t>record  of</w:t>
-      </w:r>
-      <w:proofErr w:type="gramEnd"/>
-      <w:r>
-        <w:t xml:space="preserve"> </w:t>
+      <w:r>
+        <w:t xml:space="preserve">record of </w:t>
       </w:r>
       <w:r>
         <w:t>target</w:t>
@@ -2523,13 +2492,13 @@
         <w:t>actual</w:t>
       </w:r>
       <w:r>
-        <w:t>, budget and expenses and per district</w:t>
-      </w:r>
-      <w:r>
-        <w:rPr>
-          <w:spacing w:val="3"/>
-        </w:rPr>
-        <w:t xml:space="preserve"> </w:t>
+        <w:t>, budget and expenses and per</w:t>
+      </w:r>
+      <w:r>
+        <w:t xml:space="preserve"> </w:t>
+      </w:r>
+      <w:r>
+        <w:t>district</w:t>
       </w:r>
       <w:r>
         <w:rPr>
@@ -3282,23 +3251,7 @@
         <w:jc w:val="both"/>
       </w:pPr>
       <w:r>
-        <w:t xml:space="preserve">The study will be conducted at Cavite State University-Cavite City Campus, situated at </w:t>
-      </w:r>
-      <w:proofErr w:type="spellStart"/>
-      <w:r>
-        <w:t>Pulo</w:t>
-      </w:r>
-      <w:proofErr w:type="spellEnd"/>
-      <w:r>
-        <w:t xml:space="preserve"> II, </w:t>
-      </w:r>
-      <w:proofErr w:type="spellStart"/>
-      <w:r>
-        <w:t>Dalahican</w:t>
-      </w:r>
-      <w:proofErr w:type="spellEnd"/>
-      <w:r>
-        <w:t>, Cav</w:t>
+        <w:t>The study will be conducted at Cavite State University-Cavite City Campus, situated at Pulo II, Dalahican, Cav</w:t>
       </w:r>
       <w:r>
         <w:t>ite City, from February 2025 until the present.</w:t>
@@ -3382,15 +3335,7 @@
         <w:t>aims to systemize</w:t>
       </w:r>
       <w:r>
-        <w:t xml:space="preserve"> member records, track target vs. actual, and generate reports. This will allow Red Cross branches in Silang and </w:t>
-      </w:r>
-      <w:proofErr w:type="spellStart"/>
-      <w:r>
-        <w:t>Dasmariñas</w:t>
-      </w:r>
-      <w:proofErr w:type="spellEnd"/>
-      <w:r>
-        <w:t xml:space="preserve"> to forward their member</w:t>
+        <w:t xml:space="preserve"> member records, track target vs. actual, and generate reports. This will allow Red Cross branches in Silang and Dasmariñas to forward their member</w:t>
       </w:r>
       <w:r>
         <w:rPr>
@@ -5576,15 +5521,7 @@
         <w:jc w:val="both"/>
       </w:pPr>
       <w:r>
-        <w:t xml:space="preserve">As stated by </w:t>
-      </w:r>
-      <w:proofErr w:type="spellStart"/>
-      <w:r>
-        <w:t>Hambali</w:t>
-      </w:r>
-      <w:proofErr w:type="spellEnd"/>
-      <w:r>
-        <w:t xml:space="preserve"> et al. (2024), membership management systems are essential for handling large numbers of members as manual record-keeping</w:t>
+        <w:t>As stated by Hambali et al. (2024), membership management systems are essential for handling large numbers of members as manual record-keeping</w:t>
       </w:r>
       <w:r>
         <w:rPr>
@@ -5613,15 +5550,7 @@
         <w:jc w:val="both"/>
       </w:pPr>
       <w:r>
-        <w:t xml:space="preserve">In another research conducted by </w:t>
-      </w:r>
-      <w:proofErr w:type="spellStart"/>
-      <w:r>
-        <w:t>Ardhianti</w:t>
-      </w:r>
-      <w:proofErr w:type="spellEnd"/>
-      <w:r>
-        <w:t xml:space="preserve"> et al. (2022), the Membership Information System (MIS) is a web-based platform designed for companies with a membership business model. It manages member transactions, automates promotions, and facilitates automatic rewards for member sales. Its features include product marketing content management, category and product data management, order and reward management, sales tracking, shopping carts, payment gateways, and shipping integration. This study demonstrates how MIS improves business operations</w:t>
+        <w:t>In another research conducted by Ardhianti et al. (2022), the Membership Information System (MIS) is a web-based platform designed for companies with a membership business model. It manages member transactions, automates promotions, and facilitates automatic rewards for member sales. Its features include product marketing content management, category and product data management, order and reward management, sales tracking, shopping carts, payment gateways, and shipping integration. This study demonstrates how MIS improves business operations</w:t>
       </w:r>
       <w:r>
         <w:rPr>
@@ -5717,15 +5646,7 @@
       </w:pPr>
       <w:r>
         <w:lastRenderedPageBreak/>
-        <w:t xml:space="preserve">member engagement. The shift from paper-based to digital record keeping deepens the need for automation and better data integration. While digital platforms enhance efficiency and organization, many still face challenges in interoperability, reinforcing the importance of developing more advanced membership and transaction management systems (Basir, Buckmaster, </w:t>
-      </w:r>
-      <w:proofErr w:type="spellStart"/>
-      <w:r>
-        <w:t>Raturi</w:t>
-      </w:r>
-      <w:proofErr w:type="spellEnd"/>
-      <w:r>
-        <w:t>, &amp; Zhang, 2024).</w:t>
+        <w:t>member engagement. The shift from paper-based to digital record keeping deepens the need for automation and better data integration. While digital platforms enhance efficiency and organization, many still face challenges in interoperability, reinforcing the importance of developing more advanced membership and transaction management systems (Basir, Buckmaster, Raturi, &amp; Zhang, 2024).</w:t>
       </w:r>
     </w:p>
     <w:p>
@@ -5736,23 +5657,7 @@
         <w:jc w:val="both"/>
       </w:pPr>
       <w:r>
-        <w:t xml:space="preserve">These studies will help the researchers to develop a system that manages membership records and claims for the Philippine Red Cross Cavite Chapter. </w:t>
-      </w:r>
-      <w:proofErr w:type="spellStart"/>
-      <w:r>
-        <w:t>Hambali</w:t>
-      </w:r>
-      <w:proofErr w:type="spellEnd"/>
-      <w:r>
-        <w:t xml:space="preserve"> et al. (2024) studied the need for digital systems as manual record-keeping becomes inefficient, demonstrating how automation improves data management and user access. Similarly, </w:t>
-      </w:r>
-      <w:proofErr w:type="spellStart"/>
-      <w:r>
-        <w:t>Ardhianti</w:t>
-      </w:r>
-      <w:proofErr w:type="spellEnd"/>
-      <w:r>
-        <w:t xml:space="preserve"> et al. (2022) show that web-based platforms</w:t>
+        <w:t>These studies will help the researchers to develop a system that manages membership records and claims for the Philippine Red Cross Cavite Chapter. Hambali et al. (2024) studied the need for digital systems as manual record-keeping becomes inefficient, demonstrating how automation improves data management and user access. Similarly, Ardhianti et al. (2022) show that web-based platforms</w:t>
       </w:r>
       <w:r>
         <w:rPr>
@@ -5761,15 +5666,7 @@
         <w:t xml:space="preserve"> </w:t>
       </w:r>
       <w:r>
-        <w:t xml:space="preserve">enhance transaction tracking and member engagement through automated processes. Basir, Buckmaster, </w:t>
-      </w:r>
-      <w:proofErr w:type="spellStart"/>
-      <w:r>
-        <w:t>Raturi</w:t>
-      </w:r>
-      <w:proofErr w:type="spellEnd"/>
-      <w:r>
-        <w:t xml:space="preserve">, &amp; Zhang (2024) discuss the shift to digital records, addressing challenges in system compatibility. Their findings provide meaningful and valuable insights for creating a reliable and organized membership </w:t>
+        <w:t xml:space="preserve">enhance transaction tracking and member engagement through automated processes. Basir, Buckmaster, Raturi, &amp; Zhang (2024) discuss the shift to digital records, addressing challenges in system compatibility. Their findings provide meaningful and valuable insights for creating a reliable and organized membership </w:t>
       </w:r>
       <w:r>
         <w:rPr>
@@ -5889,15 +5786,7 @@
         <w:jc w:val="both"/>
       </w:pPr>
       <w:r>
-        <w:t xml:space="preserve">The article by </w:t>
-      </w:r>
-      <w:proofErr w:type="spellStart"/>
-      <w:r>
-        <w:t>Semil</w:t>
-      </w:r>
-      <w:proofErr w:type="spellEnd"/>
-      <w:r>
-        <w:t xml:space="preserve"> (2022) provides a comprehensive overview of web page design using HTML, CSS, and JavaScript, highlighting the importance of each technology in modern web development. HTML serves as the foundation of web structure, CSS is responsible for the visual presentation, and JavaScript adds dynamic features and interactivity. The author emphasizes how the integration of these technologies allows developers to create websites that are not only visually appealing but also functional and responsive to users' needs. Moreover, the paper discusses the evolution of web development practices, particularly focusing on how web design has become more intuitive and accessible due to the advances in these coding languages.</w:t>
+        <w:t>The article by Semil (2022) provides a comprehensive overview of web page design using HTML, CSS, and JavaScript, highlighting the importance of each technology in modern web development. HTML serves as the foundation of web structure, CSS is responsible for the visual presentation, and JavaScript adds dynamic features and interactivity. The author emphasizes how the integration of these technologies allows developers to create websites that are not only visually appealing but also functional and responsive to users' needs. Moreover, the paper discusses the evolution of web development practices, particularly focusing on how web design has become more intuitive and accessible due to the advances in these coding languages.</w:t>
       </w:r>
     </w:p>
     <w:p>
@@ -5908,15 +5797,7 @@
         <w:jc w:val="both"/>
       </w:pPr>
       <w:r>
-        <w:t xml:space="preserve">The research of </w:t>
-      </w:r>
-      <w:proofErr w:type="spellStart"/>
-      <w:r>
-        <w:t>Semil</w:t>
-      </w:r>
-      <w:proofErr w:type="spellEnd"/>
-      <w:r>
-        <w:t xml:space="preserve"> (2022), along with the studies of Pathak et al. (2024) and Mal et al. (2024), will greatly help the developers in creating a functional and visually appealing membership system for the Philippine Red Cross Cavite Chapter. HTML will define the system’s structure, CSS will enhance its design, and JavaScript will add interactive features to improve user experience. These technologies will</w:t>
+        <w:t>The research of Semil (2022), along with the studies of Pathak et al. (2024) and Mal et al. (2024), will greatly help the developers in creating a functional and visually appealing membership system for the Philippine Red Cross Cavite Chapter. HTML will define the system’s structure, CSS will enhance its design, and JavaScript will add interactive features to improve user experience. These technologies will</w:t>
       </w:r>
       <w:r>
         <w:rPr>
@@ -5999,15 +5880,7 @@
         <w:jc w:val="both"/>
       </w:pPr>
       <w:r>
-        <w:t xml:space="preserve">The rapid growth of web applications has increased the risk of cyber threats, making security a top priority. As stated by </w:t>
-      </w:r>
-      <w:proofErr w:type="spellStart"/>
-      <w:r>
-        <w:t>Gandikota</w:t>
-      </w:r>
-      <w:proofErr w:type="spellEnd"/>
-      <w:r>
-        <w:t xml:space="preserve"> et al. (2023), conducting comprehensive vulnerability assessments and penetration testing is essential in identifying</w:t>
+        <w:t>The rapid growth of web applications has increased the risk of cyber threats, making security a top priority. As stated by Gandikota et al. (2023), conducting comprehensive vulnerability assessments and penetration testing is essential in identifying</w:t>
       </w:r>
       <w:r>
         <w:rPr>
@@ -6307,11 +6180,9 @@
         </w:rPr>
         <w:t xml:space="preserve"> </w:t>
       </w:r>
-      <w:proofErr w:type="spellStart"/>
       <w:r>
         <w:t>Gandikota</w:t>
       </w:r>
-      <w:proofErr w:type="spellEnd"/>
       <w:r>
         <w:rPr>
           <w:spacing w:val="40"/>
@@ -7108,15 +6979,7 @@
         <w:t xml:space="preserve">Portability </w:t>
       </w:r>
       <w:r>
-        <w:t xml:space="preserve">measures the ease with which a system, product, or component can be transferred to different environments, including hardware or software platforms. This characteristic includes adaptability, </w:t>
-      </w:r>
-      <w:proofErr w:type="spellStart"/>
-      <w:r>
-        <w:t>installability</w:t>
-      </w:r>
-      <w:proofErr w:type="spellEnd"/>
-      <w:r>
-        <w:t>, and replaceability.</w:t>
+        <w:t>measures the ease with which a system, product, or component can be transferred to different environments, including hardware or software platforms. This characteristic includes adaptability, installability, and replaceability.</w:t>
       </w:r>
     </w:p>
     <w:p>
@@ -10533,13 +10396,8 @@
         <w:ind w:left="1322" w:right="427" w:hanging="720"/>
         <w:jc w:val="both"/>
       </w:pPr>
-      <w:proofErr w:type="spellStart"/>
-      <w:r>
-        <w:t>Ardhianti</w:t>
-      </w:r>
-      <w:proofErr w:type="spellEnd"/>
-      <w:r>
-        <w:t xml:space="preserve">, P. W., &amp; Firdaus, N. (2022, August). </w:t>
+      <w:r>
+        <w:t xml:space="preserve">Ardhianti, P. W., &amp; Firdaus, N. (2022, August). </w:t>
       </w:r>
       <w:r>
         <w:rPr>
@@ -10602,15 +10460,7 @@
         <w:jc w:val="both"/>
       </w:pPr>
       <w:r>
-        <w:t xml:space="preserve">Basir, M. S., Buckmaster, D., </w:t>
-      </w:r>
-      <w:proofErr w:type="spellStart"/>
-      <w:r>
-        <w:t>Raturi</w:t>
-      </w:r>
-      <w:proofErr w:type="spellEnd"/>
-      <w:r>
-        <w:t xml:space="preserve">, A., &amp; Zhang, Y. (2024). </w:t>
+        <w:t xml:space="preserve">Basir, M. S., Buckmaster, D., Raturi, A., &amp; Zhang, Y. (2024). </w:t>
       </w:r>
       <w:r>
         <w:rPr>
@@ -10692,45 +10542,8 @@
         <w:ind w:left="1322" w:right="431" w:hanging="720"/>
         <w:jc w:val="both"/>
       </w:pPr>
-      <w:proofErr w:type="spellStart"/>
-      <w:r>
-        <w:t>Gandikota</w:t>
-      </w:r>
-      <w:proofErr w:type="spellEnd"/>
-      <w:r>
-        <w:t xml:space="preserve">, P. S. S. K., </w:t>
-      </w:r>
-      <w:proofErr w:type="spellStart"/>
-      <w:r>
-        <w:t>Valluri</w:t>
-      </w:r>
-      <w:proofErr w:type="spellEnd"/>
-      <w:r>
-        <w:t xml:space="preserve">, D., </w:t>
-      </w:r>
-      <w:proofErr w:type="spellStart"/>
-      <w:r>
-        <w:t>Mundru</w:t>
-      </w:r>
-      <w:proofErr w:type="spellEnd"/>
-      <w:r>
-        <w:t xml:space="preserve">, S. B., </w:t>
-      </w:r>
-      <w:proofErr w:type="spellStart"/>
-      <w:r>
-        <w:t>Yanala</w:t>
-      </w:r>
-      <w:proofErr w:type="spellEnd"/>
-      <w:r>
-        <w:t xml:space="preserve">, G. K., &amp; </w:t>
-      </w:r>
-      <w:proofErr w:type="spellStart"/>
-      <w:r>
-        <w:t>Sushaini</w:t>
-      </w:r>
-      <w:proofErr w:type="spellEnd"/>
-      <w:r>
-        <w:t>, S.</w:t>
+      <w:r>
+        <w:t>Gandikota, P. S. S. K., Valluri, D., Mundru, S. B., Yanala, G. K., &amp; Sushaini, S.</w:t>
       </w:r>
       <w:r>
         <w:rPr>
@@ -10771,21 +10584,8 @@
         <w:ind w:left="1322" w:right="432" w:hanging="720"/>
         <w:jc w:val="both"/>
       </w:pPr>
-      <w:proofErr w:type="spellStart"/>
-      <w:r>
-        <w:t>Hambali</w:t>
-      </w:r>
-      <w:proofErr w:type="spellEnd"/>
-      <w:r>
-        <w:t xml:space="preserve">, M. H., </w:t>
-      </w:r>
-      <w:proofErr w:type="spellStart"/>
-      <w:r>
-        <w:t>Alsamman</w:t>
-      </w:r>
-      <w:proofErr w:type="spellEnd"/>
-      <w:r>
-        <w:t xml:space="preserve">, M., Osman, B., &amp; Mohammed, F. (2024). </w:t>
+      <w:r>
+        <w:t xml:space="preserve">Hambali, M. H., Alsamman, M., Osman, B., &amp; Mohammed, F. (2024). </w:t>
       </w:r>
       <w:r>
         <w:rPr>
@@ -10852,13 +10652,8 @@
           <w:sz w:val="23"/>
         </w:rPr>
       </w:pPr>
-      <w:proofErr w:type="spellStart"/>
-      <w:r>
-        <w:t>Hjelm</w:t>
-      </w:r>
-      <w:proofErr w:type="spellEnd"/>
-      <w:r>
-        <w:t xml:space="preserve">, J. (2020). </w:t>
+      <w:r>
+        <w:t xml:space="preserve">Hjelm, J. (2020). </w:t>
       </w:r>
       <w:r>
         <w:rPr>
@@ -11144,35 +10939,13 @@
         <w:rPr>
           <w:spacing w:val="-2"/>
         </w:rPr>
-        <w:t>_</w:t>
-      </w:r>
-      <w:proofErr w:type="spellStart"/>
-      <w:r>
-        <w:rPr>
-          <w:spacing w:val="-2"/>
-        </w:rPr>
-        <w:t>an_information_system_in_a_non</w:t>
-      </w:r>
-      <w:proofErr w:type="spellEnd"/>
-      <w:r>
-        <w:rPr>
-          <w:spacing w:val="-2"/>
-        </w:rPr>
-        <w:t xml:space="preserve">- </w:t>
-      </w:r>
-      <w:proofErr w:type="spellStart"/>
+        <w:t xml:space="preserve">_an_information_system_in_a_non- </w:t>
+      </w:r>
       <w:r>
         <w:rPr>
           <w:spacing w:val="-4"/>
         </w:rPr>
-        <w:t>profit_organization_in_a_developing_country</w:t>
-      </w:r>
-      <w:proofErr w:type="spellEnd"/>
-      <w:r>
-        <w:rPr>
-          <w:spacing w:val="-4"/>
-        </w:rPr>
-        <w:t>_-</w:t>
+        <w:t>profit_organization_in_a_developing_country_-</w:t>
       </w:r>
     </w:p>
     <w:p>
@@ -11187,14 +10960,12 @@
         </w:rPr>
         <w:t xml:space="preserve">_Challenges_and_essential_factors_to_take_into_consideration_in_the_preli </w:t>
       </w:r>
-      <w:proofErr w:type="spellStart"/>
       <w:r>
         <w:rPr>
           <w:spacing w:val="-2"/>
         </w:rPr>
         <w:t>minary_work_and_implementatio</w:t>
       </w:r>
-      <w:proofErr w:type="spellEnd"/>
     </w:p>
     <w:p>
       <w:pPr>
@@ -11294,16 +11065,8 @@
         <w:rPr>
           <w:spacing w:val="-2"/>
         </w:rPr>
-        <w:t>_</w:t>
-      </w:r>
-      <w:proofErr w:type="spellStart"/>
-      <w:r>
-        <w:rPr>
-          <w:spacing w:val="-2"/>
-        </w:rPr>
-        <w:t>for_Developing_MIS_for_NGOs</w:t>
-      </w:r>
-      <w:proofErr w:type="spellEnd"/>
+        <w:t>_for_Developing_MIS_for_NGOs</w:t>
+      </w:r>
     </w:p>
     <w:p>
       <w:pPr>
@@ -11901,27 +11664,7 @@
           <w:spacing w:val="-2"/>
           <w:sz w:val="23"/>
         </w:rPr>
-        <w:t>(</w:t>
-      </w:r>
-      <w:proofErr w:type="spellStart"/>
-      <w:r>
-        <w:rPr>
-          <w:rFonts w:ascii="Arial" w:hAnsi="Arial"/>
-          <w:i/>
-          <w:spacing w:val="-2"/>
-          <w:sz w:val="23"/>
-        </w:rPr>
-        <w:t>SQuaRE</w:t>
-      </w:r>
-      <w:proofErr w:type="spellEnd"/>
-      <w:r>
-        <w:rPr>
-          <w:rFonts w:ascii="Arial" w:hAnsi="Arial"/>
-          <w:i/>
-          <w:spacing w:val="-2"/>
-          <w:sz w:val="23"/>
-        </w:rPr>
-        <w:t>)—Product</w:t>
+        <w:t>(SQuaRE)—Product</w:t>
       </w:r>
       <w:r>
         <w:rPr>
@@ -12124,21 +11867,7 @@
         <w:rPr>
           <w:spacing w:val="-2"/>
         </w:rPr>
-        <w:t xml:space="preserve"> intelligence/</w:t>
-      </w:r>
-      <w:proofErr w:type="spellStart"/>
-      <w:r>
-        <w:rPr>
-          <w:spacing w:val="-2"/>
-        </w:rPr>
-        <w:t>philippines</w:t>
-      </w:r>
-      <w:proofErr w:type="spellEnd"/>
-      <w:r>
-        <w:rPr>
-          <w:spacing w:val="-2"/>
-        </w:rPr>
-        <w:t>-cybersecurity-market</w:t>
+        <w:t xml:space="preserve"> intelligence/philippines-cybersecurity-market</w:t>
       </w:r>
     </w:p>
     <w:p>
@@ -12510,16 +12239,8 @@
         <w:rPr>
           <w:spacing w:val="-2"/>
         </w:rPr>
-        <w:t xml:space="preserve"> </w:t>
-      </w:r>
-      <w:proofErr w:type="spellStart"/>
-      <w:r>
-        <w:rPr>
-          <w:spacing w:val="-2"/>
-        </w:rPr>
-        <w:t>ectiveness_Of_Management_Information_System_In_Decision_Making</w:t>
-      </w:r>
-      <w:proofErr w:type="spellEnd"/>
+        <w:t xml:space="preserve"> ectiveness_Of_Management_Information_System_In_Decision_Making</w:t>
+      </w:r>
     </w:p>
     <w:p>
       <w:pPr>
@@ -13053,13 +12774,8 @@
         <w:spacing w:line="487" w:lineRule="auto"/>
         <w:ind w:left="1322" w:right="456" w:hanging="720"/>
       </w:pPr>
-      <w:proofErr w:type="spellStart"/>
-      <w:r>
-        <w:t>Semil</w:t>
-      </w:r>
-      <w:proofErr w:type="spellEnd"/>
-      <w:r>
-        <w:t>,</w:t>
+      <w:r>
+        <w:t>Semil,</w:t>
       </w:r>
       <w:r>
         <w:rPr>
@@ -13315,7 +13031,7 @@
 </file>
 
 <file path=word/endnotes.xml><?xml version="1.0" encoding="utf-8"?>
-<w:endnotes xmlns:wpc="http://schemas.microsoft.com/office/word/2010/wordprocessingCanvas" xmlns:cx="http://schemas.microsoft.com/office/drawing/2014/chartex" xmlns:cx1="http://schemas.microsoft.com/office/drawing/2015/9/8/chartex" xmlns:cx2="http://schemas.microsoft.com/office/drawing/2015/10/21/chartex" xmlns:cx3="http://schemas.microsoft.com/office/drawing/2016/5/9/chartex" xmlns:cx4="http://schemas.microsoft.com/office/drawing/2016/5/10/chartex" xmlns:cx5="http://schemas.microsoft.com/office/drawing/2016/5/11/chartex" xmlns:cx6="http://schemas.microsoft.com/office/drawing/2016/5/12/chartex" xmlns:cx7="http://schemas.microsoft.com/office/drawing/2016/5/13/chartex" xmlns:cx8="http://schemas.microsoft.com/office/drawing/2016/5/14/chartex" xmlns:mc="http://schemas.openxmlformats.org/markup-compatibility/2006" xmlns:aink="http://schemas.microsoft.com/office/drawing/2016/ink" xmlns:am3d="http://schemas.microsoft.com/office/drawing/2017/model3d" xmlns:o="urn:schemas-microsoft-com:office:office" xmlns:oel="http://schemas.microsoft.com/office/2019/extlst" xmlns:r="http://schemas.openxmlformats.org/officeDocument/2006/relationships" xmlns:m="http://schemas.openxmlformats.org/officeDocument/2006/math" xmlns:v="urn:schemas-microsoft-com:vml" xmlns:wp14="http://schemas.microsoft.com/office/word/2010/wordprocessingDrawing" xmlns:wp="http://schemas.openxmlformats.org/drawingml/2006/wordprocessingDrawing" xmlns:w10="urn:schemas-microsoft-com:office:word" xmlns:w="http://schemas.openxmlformats.org/wordprocessingml/2006/main" xmlns:w14="http://schemas.microsoft.com/office/word/2010/wordml" xmlns:w15="http://schemas.microsoft.com/office/word/2012/wordml" xmlns:w16cex="http://schemas.microsoft.com/office/word/2018/wordml/cex" xmlns:w16cid="http://schemas.microsoft.com/office/word/2016/wordml/cid" xmlns:w16="http://schemas.microsoft.com/office/word/2018/wordml" xmlns:w16sdtdh="http://schemas.microsoft.com/office/word/2020/wordml/sdtdatahash" xmlns:w16se="http://schemas.microsoft.com/office/word/2015/wordml/symex" xmlns:wpg="http://schemas.microsoft.com/office/word/2010/wordprocessingGroup" xmlns:wpi="http://schemas.microsoft.com/office/word/2010/wordprocessingInk" xmlns:wne="http://schemas.microsoft.com/office/word/2006/wordml" xmlns:wps="http://schemas.microsoft.com/office/word/2010/wordprocessingShape" mc:Ignorable="w14 w15 w16se w16cid w16 w16cex w16sdtdh wp14">
+<w:endnotes xmlns:wpc="http://schemas.microsoft.com/office/word/2010/wordprocessingCanvas" xmlns:cx="http://schemas.microsoft.com/office/drawing/2014/chartex" xmlns:cx1="http://schemas.microsoft.com/office/drawing/2015/9/8/chartex" xmlns:cx2="http://schemas.microsoft.com/office/drawing/2015/10/21/chartex" xmlns:cx3="http://schemas.microsoft.com/office/drawing/2016/5/9/chartex" xmlns:cx4="http://schemas.microsoft.com/office/drawing/2016/5/10/chartex" xmlns:cx5="http://schemas.microsoft.com/office/drawing/2016/5/11/chartex" xmlns:cx6="http://schemas.microsoft.com/office/drawing/2016/5/12/chartex" xmlns:cx7="http://schemas.microsoft.com/office/drawing/2016/5/13/chartex" xmlns:cx8="http://schemas.microsoft.com/office/drawing/2016/5/14/chartex" xmlns:mc="http://schemas.openxmlformats.org/markup-compatibility/2006" xmlns:aink="http://schemas.microsoft.com/office/drawing/2016/ink" xmlns:am3d="http://schemas.microsoft.com/office/drawing/2017/model3d" xmlns:o="urn:schemas-microsoft-com:office:office" xmlns:oel="http://schemas.microsoft.com/office/2019/extlst" xmlns:r="http://schemas.openxmlformats.org/officeDocument/2006/relationships" xmlns:m="http://schemas.openxmlformats.org/officeDocument/2006/math" xmlns:v="urn:schemas-microsoft-com:vml" xmlns:wp14="http://schemas.microsoft.com/office/word/2010/wordprocessingDrawing" xmlns:wp="http://schemas.openxmlformats.org/drawingml/2006/wordprocessingDrawing" xmlns:w10="urn:schemas-microsoft-com:office:word" xmlns:w="http://schemas.openxmlformats.org/wordprocessingml/2006/main" xmlns:w14="http://schemas.microsoft.com/office/word/2010/wordml" xmlns:w15="http://schemas.microsoft.com/office/word/2012/wordml" xmlns:w16cex="http://schemas.microsoft.com/office/word/2018/wordml/cex" xmlns:w16cid="http://schemas.microsoft.com/office/word/2016/wordml/cid" xmlns:w16="http://schemas.microsoft.com/office/word/2018/wordml" xmlns:w16du="http://schemas.microsoft.com/office/word/2023/wordml/word16du" xmlns:w16sdtdh="http://schemas.microsoft.com/office/word/2020/wordml/sdtdatahash" xmlns:w16sdtfl="http://schemas.microsoft.com/office/word/2024/wordml/sdtformatlock" xmlns:w16se="http://schemas.microsoft.com/office/word/2015/wordml/symex" xmlns:wpg="http://schemas.microsoft.com/office/word/2010/wordprocessingGroup" xmlns:wpi="http://schemas.microsoft.com/office/word/2010/wordprocessingInk" xmlns:wne="http://schemas.microsoft.com/office/word/2006/wordml" xmlns:wps="http://schemas.microsoft.com/office/word/2010/wordprocessingShape" mc:Ignorable="w14 w15 w16se w16cid w16 w16cex w16sdtdh w16sdtfl w16du wp14">
   <w:endnote w:type="separator" w:id="-1">
     <w:p>
       <w:r>
@@ -13334,7 +13050,7 @@
 </file>
 
 <file path=word/footnotes.xml><?xml version="1.0" encoding="utf-8"?>
-<w:footnotes xmlns:wpc="http://schemas.microsoft.com/office/word/2010/wordprocessingCanvas" xmlns:cx="http://schemas.microsoft.com/office/drawing/2014/chartex" xmlns:cx1="http://schemas.microsoft.com/office/drawing/2015/9/8/chartex" xmlns:cx2="http://schemas.microsoft.com/office/drawing/2015/10/21/chartex" xmlns:cx3="http://schemas.microsoft.com/office/drawing/2016/5/9/chartex" xmlns:cx4="http://schemas.microsoft.com/office/drawing/2016/5/10/chartex" xmlns:cx5="http://schemas.microsoft.com/office/drawing/2016/5/11/chartex" xmlns:cx6="http://schemas.microsoft.com/office/drawing/2016/5/12/chartex" xmlns:cx7="http://schemas.microsoft.com/office/drawing/2016/5/13/chartex" xmlns:cx8="http://schemas.microsoft.com/office/drawing/2016/5/14/chartex" xmlns:mc="http://schemas.openxmlformats.org/markup-compatibility/2006" xmlns:aink="http://schemas.microsoft.com/office/drawing/2016/ink" xmlns:am3d="http://schemas.microsoft.com/office/drawing/2017/model3d" xmlns:o="urn:schemas-microsoft-com:office:office" xmlns:oel="http://schemas.microsoft.com/office/2019/extlst" xmlns:r="http://schemas.openxmlformats.org/officeDocument/2006/relationships" xmlns:m="http://schemas.openxmlformats.org/officeDocument/2006/math" xmlns:v="urn:schemas-microsoft-com:vml" xmlns:wp14="http://schemas.microsoft.com/office/word/2010/wordprocessingDrawing" xmlns:wp="http://schemas.openxmlformats.org/drawingml/2006/wordprocessingDrawing" xmlns:w10="urn:schemas-microsoft-com:office:word" xmlns:w="http://schemas.openxmlformats.org/wordprocessingml/2006/main" xmlns:w14="http://schemas.microsoft.com/office/word/2010/wordml" xmlns:w15="http://schemas.microsoft.com/office/word/2012/wordml" xmlns:w16cex="http://schemas.microsoft.com/office/word/2018/wordml/cex" xmlns:w16cid="http://schemas.microsoft.com/office/word/2016/wordml/cid" xmlns:w16="http://schemas.microsoft.com/office/word/2018/wordml" xmlns:w16sdtdh="http://schemas.microsoft.com/office/word/2020/wordml/sdtdatahash" xmlns:w16se="http://schemas.microsoft.com/office/word/2015/wordml/symex" xmlns:wpg="http://schemas.microsoft.com/office/word/2010/wordprocessingGroup" xmlns:wpi="http://schemas.microsoft.com/office/word/2010/wordprocessingInk" xmlns:wne="http://schemas.microsoft.com/office/word/2006/wordml" xmlns:wps="http://schemas.microsoft.com/office/word/2010/wordprocessingShape" mc:Ignorable="w14 w15 w16se w16cid w16 w16cex w16sdtdh wp14">
+<w:footnotes xmlns:wpc="http://schemas.microsoft.com/office/word/2010/wordprocessingCanvas" xmlns:cx="http://schemas.microsoft.com/office/drawing/2014/chartex" xmlns:cx1="http://schemas.microsoft.com/office/drawing/2015/9/8/chartex" xmlns:cx2="http://schemas.microsoft.com/office/drawing/2015/10/21/chartex" xmlns:cx3="http://schemas.microsoft.com/office/drawing/2016/5/9/chartex" xmlns:cx4="http://schemas.microsoft.com/office/drawing/2016/5/10/chartex" xmlns:cx5="http://schemas.microsoft.com/office/drawing/2016/5/11/chartex" xmlns:cx6="http://schemas.microsoft.com/office/drawing/2016/5/12/chartex" xmlns:cx7="http://schemas.microsoft.com/office/drawing/2016/5/13/chartex" xmlns:cx8="http://schemas.microsoft.com/office/drawing/2016/5/14/chartex" xmlns:mc="http://schemas.openxmlformats.org/markup-compatibility/2006" xmlns:aink="http://schemas.microsoft.com/office/drawing/2016/ink" xmlns:am3d="http://schemas.microsoft.com/office/drawing/2017/model3d" xmlns:o="urn:schemas-microsoft-com:office:office" xmlns:oel="http://schemas.microsoft.com/office/2019/extlst" xmlns:r="http://schemas.openxmlformats.org/officeDocument/2006/relationships" xmlns:m="http://schemas.openxmlformats.org/officeDocument/2006/math" xmlns:v="urn:schemas-microsoft-com:vml" xmlns:wp14="http://schemas.microsoft.com/office/word/2010/wordprocessingDrawing" xmlns:wp="http://schemas.openxmlformats.org/drawingml/2006/wordprocessingDrawing" xmlns:w10="urn:schemas-microsoft-com:office:word" xmlns:w="http://schemas.openxmlformats.org/wordprocessingml/2006/main" xmlns:w14="http://schemas.microsoft.com/office/word/2010/wordml" xmlns:w15="http://schemas.microsoft.com/office/word/2012/wordml" xmlns:w16cex="http://schemas.microsoft.com/office/word/2018/wordml/cex" xmlns:w16cid="http://schemas.microsoft.com/office/word/2016/wordml/cid" xmlns:w16="http://schemas.microsoft.com/office/word/2018/wordml" xmlns:w16du="http://schemas.microsoft.com/office/word/2023/wordml/word16du" xmlns:w16sdtdh="http://schemas.microsoft.com/office/word/2020/wordml/sdtdatahash" xmlns:w16sdtfl="http://schemas.microsoft.com/office/word/2024/wordml/sdtformatlock" xmlns:w16se="http://schemas.microsoft.com/office/word/2015/wordml/symex" xmlns:wpg="http://schemas.microsoft.com/office/word/2010/wordprocessingGroup" xmlns:wpi="http://schemas.microsoft.com/office/word/2010/wordprocessingInk" xmlns:wne="http://schemas.microsoft.com/office/word/2006/wordml" xmlns:wps="http://schemas.microsoft.com/office/word/2010/wordprocessingShape" mc:Ignorable="w14 w15 w16se w16cid w16 w16cex w16sdtdh w16sdtfl w16du wp14">
   <w:footnote w:type="separator" w:id="-1">
     <w:p>
       <w:r>
@@ -13353,7 +13069,7 @@
 </file>
 
 <file path=word/header1.xml><?xml version="1.0" encoding="utf-8"?>
-<w:hdr xmlns:wpc="http://schemas.microsoft.com/office/word/2010/wordprocessingCanvas" xmlns:cx="http://schemas.microsoft.com/office/drawing/2014/chartex" xmlns:cx1="http://schemas.microsoft.com/office/drawing/2015/9/8/chartex" xmlns:cx2="http://schemas.microsoft.com/office/drawing/2015/10/21/chartex" xmlns:cx3="http://schemas.microsoft.com/office/drawing/2016/5/9/chartex" xmlns:cx4="http://schemas.microsoft.com/office/drawing/2016/5/10/chartex" xmlns:cx5="http://schemas.microsoft.com/office/drawing/2016/5/11/chartex" xmlns:cx6="http://schemas.microsoft.com/office/drawing/2016/5/12/chartex" xmlns:cx7="http://schemas.microsoft.com/office/drawing/2016/5/13/chartex" xmlns:cx8="http://schemas.microsoft.com/office/drawing/2016/5/14/chartex" xmlns:mc="http://schemas.openxmlformats.org/markup-compatibility/2006" xmlns:aink="http://schemas.microsoft.com/office/drawing/2016/ink" xmlns:am3d="http://schemas.microsoft.com/office/drawing/2017/model3d" xmlns:o="urn:schemas-microsoft-com:office:office" xmlns:oel="http://schemas.microsoft.com/office/2019/extlst" xmlns:r="http://schemas.openxmlformats.org/officeDocument/2006/relationships" xmlns:m="http://schemas.openxmlformats.org/officeDocument/2006/math" xmlns:v="urn:schemas-microsoft-com:vml" xmlns:wp14="http://schemas.microsoft.com/office/word/2010/wordprocessingDrawing" xmlns:wp="http://schemas.openxmlformats.org/drawingml/2006/wordprocessingDrawing" xmlns:w10="urn:schemas-microsoft-com:office:word" xmlns:w="http://schemas.openxmlformats.org/wordprocessingml/2006/main" xmlns:w14="http://schemas.microsoft.com/office/word/2010/wordml" xmlns:w15="http://schemas.microsoft.com/office/word/2012/wordml" xmlns:w16cex="http://schemas.microsoft.com/office/word/2018/wordml/cex" xmlns:w16cid="http://schemas.microsoft.com/office/word/2016/wordml/cid" xmlns:w16="http://schemas.microsoft.com/office/word/2018/wordml" xmlns:w16sdtdh="http://schemas.microsoft.com/office/word/2020/wordml/sdtdatahash" xmlns:w16se="http://schemas.microsoft.com/office/word/2015/wordml/symex" xmlns:wpg="http://schemas.microsoft.com/office/word/2010/wordprocessingGroup" xmlns:wpi="http://schemas.microsoft.com/office/word/2010/wordprocessingInk" xmlns:wne="http://schemas.microsoft.com/office/word/2006/wordml" xmlns:wps="http://schemas.microsoft.com/office/word/2010/wordprocessingShape" mc:Ignorable="w14 w15 w16se w16cid w16 w16cex w16sdtdh wp14">
+<w:hdr xmlns:wpc="http://schemas.microsoft.com/office/word/2010/wordprocessingCanvas" xmlns:cx="http://schemas.microsoft.com/office/drawing/2014/chartex" xmlns:cx1="http://schemas.microsoft.com/office/drawing/2015/9/8/chartex" xmlns:cx2="http://schemas.microsoft.com/office/drawing/2015/10/21/chartex" xmlns:cx3="http://schemas.microsoft.com/office/drawing/2016/5/9/chartex" xmlns:cx4="http://schemas.microsoft.com/office/drawing/2016/5/10/chartex" xmlns:cx5="http://schemas.microsoft.com/office/drawing/2016/5/11/chartex" xmlns:cx6="http://schemas.microsoft.com/office/drawing/2016/5/12/chartex" xmlns:cx7="http://schemas.microsoft.com/office/drawing/2016/5/13/chartex" xmlns:cx8="http://schemas.microsoft.com/office/drawing/2016/5/14/chartex" xmlns:mc="http://schemas.openxmlformats.org/markup-compatibility/2006" xmlns:aink="http://schemas.microsoft.com/office/drawing/2016/ink" xmlns:am3d="http://schemas.microsoft.com/office/drawing/2017/model3d" xmlns:o="urn:schemas-microsoft-com:office:office" xmlns:oel="http://schemas.microsoft.com/office/2019/extlst" xmlns:r="http://schemas.openxmlformats.org/officeDocument/2006/relationships" xmlns:m="http://schemas.openxmlformats.org/officeDocument/2006/math" xmlns:v="urn:schemas-microsoft-com:vml" xmlns:wp14="http://schemas.microsoft.com/office/word/2010/wordprocessingDrawing" xmlns:wp="http://schemas.openxmlformats.org/drawingml/2006/wordprocessingDrawing" xmlns:w10="urn:schemas-microsoft-com:office:word" xmlns:w="http://schemas.openxmlformats.org/wordprocessingml/2006/main" xmlns:w14="http://schemas.microsoft.com/office/word/2010/wordml" xmlns:w15="http://schemas.microsoft.com/office/word/2012/wordml" xmlns:w16cex="http://schemas.microsoft.com/office/word/2018/wordml/cex" xmlns:w16cid="http://schemas.microsoft.com/office/word/2016/wordml/cid" xmlns:w16="http://schemas.microsoft.com/office/word/2018/wordml" xmlns:w16du="http://schemas.microsoft.com/office/word/2023/wordml/word16du" xmlns:w16sdtdh="http://schemas.microsoft.com/office/word/2020/wordml/sdtdatahash" xmlns:w16sdtfl="http://schemas.microsoft.com/office/word/2024/wordml/sdtformatlock" xmlns:w16se="http://schemas.microsoft.com/office/word/2015/wordml/symex" xmlns:wpg="http://schemas.microsoft.com/office/word/2010/wordprocessingGroup" xmlns:wpi="http://schemas.microsoft.com/office/word/2010/wordprocessingInk" xmlns:wne="http://schemas.microsoft.com/office/word/2006/wordml" xmlns:wps="http://schemas.microsoft.com/office/word/2010/wordprocessingShape" mc:Ignorable="w14 w15 w16se w16cid w16 w16cex w16sdtdh w16sdtfl w16du wp14">
   <w:p>
     <w:pPr>
       <w:pStyle w:val="BodyText"/>
@@ -13511,7 +13227,7 @@
 </file>
 
 <file path=word/numbering.xml><?xml version="1.0" encoding="utf-8"?>
-<w:numbering xmlns:wpc="http://schemas.microsoft.com/office/word/2010/wordprocessingCanvas" xmlns:cx="http://schemas.microsoft.com/office/drawing/2014/chartex" xmlns:cx1="http://schemas.microsoft.com/office/drawing/2015/9/8/chartex" xmlns:cx2="http://schemas.microsoft.com/office/drawing/2015/10/21/chartex" xmlns:cx3="http://schemas.microsoft.com/office/drawing/2016/5/9/chartex" xmlns:cx4="http://schemas.microsoft.com/office/drawing/2016/5/10/chartex" xmlns:cx5="http://schemas.microsoft.com/office/drawing/2016/5/11/chartex" xmlns:cx6="http://schemas.microsoft.com/office/drawing/2016/5/12/chartex" xmlns:cx7="http://schemas.microsoft.com/office/drawing/2016/5/13/chartex" xmlns:cx8="http://schemas.microsoft.com/office/drawing/2016/5/14/chartex" xmlns:mc="http://schemas.openxmlformats.org/markup-compatibility/2006" xmlns:aink="http://schemas.microsoft.com/office/drawing/2016/ink" xmlns:am3d="http://schemas.microsoft.com/office/drawing/2017/model3d" xmlns:o="urn:schemas-microsoft-com:office:office" xmlns:oel="http://schemas.microsoft.com/office/2019/extlst" xmlns:r="http://schemas.openxmlformats.org/officeDocument/2006/relationships" xmlns:m="http://schemas.openxmlformats.org/officeDocument/2006/math" xmlns:v="urn:schemas-microsoft-com:vml" xmlns:wp14="http://schemas.microsoft.com/office/word/2010/wordprocessingDrawing" xmlns:wp="http://schemas.openxmlformats.org/drawingml/2006/wordprocessingDrawing" xmlns:w10="urn:schemas-microsoft-com:office:word" xmlns:w="http://schemas.openxmlformats.org/wordprocessingml/2006/main" xmlns:w14="http://schemas.microsoft.com/office/word/2010/wordml" xmlns:w15="http://schemas.microsoft.com/office/word/2012/wordml" xmlns:w16cex="http://schemas.microsoft.com/office/word/2018/wordml/cex" xmlns:w16cid="http://schemas.microsoft.com/office/word/2016/wordml/cid" xmlns:w16="http://schemas.microsoft.com/office/word/2018/wordml" xmlns:w16sdtdh="http://schemas.microsoft.com/office/word/2020/wordml/sdtdatahash" xmlns:w16se="http://schemas.microsoft.com/office/word/2015/wordml/symex" xmlns:wpg="http://schemas.microsoft.com/office/word/2010/wordprocessingGroup" xmlns:wpi="http://schemas.microsoft.com/office/word/2010/wordprocessingInk" xmlns:wne="http://schemas.microsoft.com/office/word/2006/wordml" xmlns:wps="http://schemas.microsoft.com/office/word/2010/wordprocessingShape" mc:Ignorable="w14 w15 w16se w16cid w16 w16cex w16sdtdh wp14">
+<w:numbering xmlns:wpc="http://schemas.microsoft.com/office/word/2010/wordprocessingCanvas" xmlns:cx="http://schemas.microsoft.com/office/drawing/2014/chartex" xmlns:cx1="http://schemas.microsoft.com/office/drawing/2015/9/8/chartex" xmlns:cx2="http://schemas.microsoft.com/office/drawing/2015/10/21/chartex" xmlns:cx3="http://schemas.microsoft.com/office/drawing/2016/5/9/chartex" xmlns:cx4="http://schemas.microsoft.com/office/drawing/2016/5/10/chartex" xmlns:cx5="http://schemas.microsoft.com/office/drawing/2016/5/11/chartex" xmlns:cx6="http://schemas.microsoft.com/office/drawing/2016/5/12/chartex" xmlns:cx7="http://schemas.microsoft.com/office/drawing/2016/5/13/chartex" xmlns:cx8="http://schemas.microsoft.com/office/drawing/2016/5/14/chartex" xmlns:mc="http://schemas.openxmlformats.org/markup-compatibility/2006" xmlns:aink="http://schemas.microsoft.com/office/drawing/2016/ink" xmlns:am3d="http://schemas.microsoft.com/office/drawing/2017/model3d" xmlns:o="urn:schemas-microsoft-com:office:office" xmlns:oel="http://schemas.microsoft.com/office/2019/extlst" xmlns:r="http://schemas.openxmlformats.org/officeDocument/2006/relationships" xmlns:m="http://schemas.openxmlformats.org/officeDocument/2006/math" xmlns:v="urn:schemas-microsoft-com:vml" xmlns:wp14="http://schemas.microsoft.com/office/word/2010/wordprocessingDrawing" xmlns:wp="http://schemas.openxmlformats.org/drawingml/2006/wordprocessingDrawing" xmlns:w10="urn:schemas-microsoft-com:office:word" xmlns:w="http://schemas.openxmlformats.org/wordprocessingml/2006/main" xmlns:w14="http://schemas.microsoft.com/office/word/2010/wordml" xmlns:w15="http://schemas.microsoft.com/office/word/2012/wordml" xmlns:w16cex="http://schemas.microsoft.com/office/word/2018/wordml/cex" xmlns:w16cid="http://schemas.microsoft.com/office/word/2016/wordml/cid" xmlns:w16="http://schemas.microsoft.com/office/word/2018/wordml" xmlns:w16du="http://schemas.microsoft.com/office/word/2023/wordml/word16du" xmlns:w16sdtdh="http://schemas.microsoft.com/office/word/2020/wordml/sdtdatahash" xmlns:w16sdtfl="http://schemas.microsoft.com/office/word/2024/wordml/sdtformatlock" xmlns:w16se="http://schemas.microsoft.com/office/word/2015/wordml/symex" xmlns:wpg="http://schemas.microsoft.com/office/word/2010/wordprocessingGroup" xmlns:wpi="http://schemas.microsoft.com/office/word/2010/wordprocessingInk" xmlns:wne="http://schemas.microsoft.com/office/word/2006/wordml" xmlns:wps="http://schemas.microsoft.com/office/word/2010/wordprocessingShape" mc:Ignorable="w14 w15 w16se w16cid w16 w16cex w16sdtdh w16sdtfl w16du wp14">
   <w:abstractNum w:abstractNumId="0" w15:restartNumberingAfterBreak="0">
     <w:nsid w:val="14ED74F0"/>
     <w:multiLevelType w:val="hybridMultilevel"/>
@@ -14030,7 +13746,7 @@
 </file>
 
 <file path=word/styles.xml><?xml version="1.0" encoding="utf-8"?>
-<w:styles xmlns:mc="http://schemas.openxmlformats.org/markup-compatibility/2006" xmlns:r="http://schemas.openxmlformats.org/officeDocument/2006/relationships" xmlns:w="http://schemas.openxmlformats.org/wordprocessingml/2006/main" xmlns:w14="http://schemas.microsoft.com/office/word/2010/wordml" xmlns:w15="http://schemas.microsoft.com/office/word/2012/wordml" xmlns:w16cex="http://schemas.microsoft.com/office/word/2018/wordml/cex" xmlns:w16cid="http://schemas.microsoft.com/office/word/2016/wordml/cid" xmlns:w16="http://schemas.microsoft.com/office/word/2018/wordml" xmlns:w16sdtdh="http://schemas.microsoft.com/office/word/2020/wordml/sdtdatahash" xmlns:w16se="http://schemas.microsoft.com/office/word/2015/wordml/symex" mc:Ignorable="w14 w15 w16se w16cid w16 w16cex w16sdtdh">
+<w:styles xmlns:mc="http://schemas.openxmlformats.org/markup-compatibility/2006" xmlns:r="http://schemas.openxmlformats.org/officeDocument/2006/relationships" xmlns:w="http://schemas.openxmlformats.org/wordprocessingml/2006/main" xmlns:w14="http://schemas.microsoft.com/office/word/2010/wordml" xmlns:w15="http://schemas.microsoft.com/office/word/2012/wordml" xmlns:w16cex="http://schemas.microsoft.com/office/word/2018/wordml/cex" xmlns:w16cid="http://schemas.microsoft.com/office/word/2016/wordml/cid" xmlns:w16="http://schemas.microsoft.com/office/word/2018/wordml" xmlns:w16du="http://schemas.microsoft.com/office/word/2023/wordml/word16du" xmlns:w16sdtdh="http://schemas.microsoft.com/office/word/2020/wordml/sdtdatahash" xmlns:w16sdtfl="http://schemas.microsoft.com/office/word/2024/wordml/sdtformatlock" xmlns:w16se="http://schemas.microsoft.com/office/word/2015/wordml/symex" mc:Ignorable="w14 w15 w16se w16cid w16 w16cex w16sdtdh w16sdtfl w16du">
   <w:docDefaults>
     <w:rPrDefault>
       <w:rPr>

</xml_diff>